<commit_message>
training: bootcamp campus is Frisco; drop datacenter fleet counts
Co-Authored-By: Claude Fable 5 <noreply@anthropic.com>
</commit_message>
<xml_diff>
--- a/AI_Agents_and_Advanced_Fine_Tuning_Bootcamp/Catalogue/AI_Agents_Bootcamp_Course_Catalogue.docx
+++ b/AI_Agents_and_Advanced_Fine_Tuning_Bootcamp/Catalogue/AI_Agents_Bootcamp_Course_Catalogue.docx
@@ -66,7 +66,7 @@
           <w:color w:val="333333"/>
           <w:sz w:val="22"/>
         </w:rPr>
-        <w:t>Format: Hybrid (in-person at Fremont campus, live Zoom, or both)</w:t>
+        <w:t>Format: Hybrid (in-person at Frisco campus, live Zoom, or both)</w:t>
       </w:r>
     </w:p>
     <w:p>
@@ -560,7 +560,7 @@
           <w:color w:val="333333"/>
           <w:sz w:val="22"/>
         </w:rPr>
-        <w:t>Access to the Proxiant Ray cluster: 20+ GPU servers, 40+ NVIDIA GPUs (RTX PRO 6000 Blackwell, RTX 5090, RTX 4090).</w:t>
+        <w:t>Access to the Proxiant Ray cluster: dedicated GPU servers (NVIDIA RTX PRO 6000 Blackwell, RTX 5090, RTX 4090).</w:t>
       </w:r>
     </w:p>
     <w:p>

</xml_diff>